<commit_message>
Replace outdated CV files with latest 3-page PDF and updated Word document
</commit_message>
<xml_diff>
--- a/assets/Ahmad_Ibrahim_CV_Final_Improved.docx
+++ b/assets/Ahmad_Ibrahim_CV_Final_Improved.docx
@@ -1,6 +1,6 @@
 
 <file path=word/document.xml><?xml version="1.0" encoding="utf-8"?>
-<w:document xmlns:wpc="http://schemas.microsoft.com/office/word/2010/wordprocessingCanvas" xmlns:cx="http://schemas.microsoft.com/office/drawing/2014/chartex" xmlns:cx1="http://schemas.microsoft.com/office/drawing/2015/9/8/chartex" xmlns:cx2="http://schemas.microsoft.com/office/drawing/2015/10/21/chartex" xmlns:cx3="http://schemas.microsoft.com/office/drawing/2016/5/9/chartex" xmlns:cx4="http://schemas.microsoft.com/office/drawing/2016/5/10/chartex" xmlns:cx5="http://schemas.microsoft.com/office/drawing/2016/5/11/chartex" xmlns:cx6="http://schemas.microsoft.com/office/drawing/2016/5/12/chartex" xmlns:cx7="http://schemas.microsoft.com/office/drawing/2016/5/13/chartex" xmlns:cx8="http://schemas.microsoft.com/office/drawing/2016/5/14/chartex" xmlns:mc="http://schemas.openxmlformats.org/markup-compatibility/2006" xmlns:aink="http://schemas.microsoft.com/office/drawing/2016/ink" xmlns:am3d="http://schemas.microsoft.com/office/drawing/2017/model3d" xmlns:o="urn:schemas-microsoft-com:office:office" xmlns:oel="http://schemas.microsoft.com/office/2019/extlst" xmlns:r="http://schemas.openxmlformats.org/officeDocument/2006/relationships" xmlns:m="http://schemas.openxmlformats.org/officeDocument/2006/math" xmlns:v="urn:schemas-microsoft-com:vml" xmlns:wp14="http://schemas.microsoft.com/office/word/2010/wordprocessingDrawing" xmlns:wp="http://schemas.openxmlformats.org/drawingml/2006/wordprocessingDrawing" xmlns:w10="urn:schemas-microsoft-com:office:word" xmlns:w="http://schemas.openxmlformats.org/wordprocessingml/2006/main" xmlns:w14="http://schemas.microsoft.com/office/word/2010/wordml" xmlns:w15="http://schemas.microsoft.com/office/word/2012/wordml" xmlns:w16cex="http://schemas.microsoft.com/office/word/2018/wordml/cex" xmlns:w16cid="http://schemas.microsoft.com/office/word/2016/wordml/cid" xmlns:w16="http://schemas.microsoft.com/office/word/2018/wordml" xmlns:w16sdtdh="http://schemas.microsoft.com/office/word/2020/wordml/sdtdatahash" xmlns:w16se="http://schemas.microsoft.com/office/word/2015/wordml/symex" xmlns:wpg="http://schemas.microsoft.com/office/word/2010/wordprocessingGroup" xmlns:wpi="http://schemas.microsoft.com/office/word/2010/wordprocessingInk" xmlns:wne="http://schemas.microsoft.com/office/word/2006/wordml" xmlns:wps="http://schemas.microsoft.com/office/word/2010/wordprocessingShape" mc:Ignorable="w14 w15 w16se w16cid w16 w16cex w16sdtdh wp14">
+<w:document xmlns:wpc="http://schemas.microsoft.com/office/word/2010/wordprocessingCanvas" xmlns:cx="http://schemas.microsoft.com/office/drawing/2014/chartex" xmlns:cx1="http://schemas.microsoft.com/office/drawing/2015/9/8/chartex" xmlns:cx2="http://schemas.microsoft.com/office/drawing/2015/10/21/chartex" xmlns:cx3="http://schemas.microsoft.com/office/drawing/2016/5/9/chartex" xmlns:cx4="http://schemas.microsoft.com/office/drawing/2016/5/10/chartex" xmlns:cx5="http://schemas.microsoft.com/office/drawing/2016/5/11/chartex" xmlns:cx6="http://schemas.microsoft.com/office/drawing/2016/5/12/chartex" xmlns:cx7="http://schemas.microsoft.com/office/drawing/2016/5/13/chartex" xmlns:cx8="http://schemas.microsoft.com/office/drawing/2016/5/14/chartex" xmlns:mc="http://schemas.openxmlformats.org/markup-compatibility/2006" xmlns:aink="http://schemas.microsoft.com/office/drawing/2016/ink" xmlns:am3d="http://schemas.microsoft.com/office/drawing/2017/model3d" xmlns:o="urn:schemas-microsoft-com:office:office" xmlns:oel="http://schemas.microsoft.com/office/2019/extlst" xmlns:r="http://schemas.openxmlformats.org/officeDocument/2006/relationships" xmlns:m="http://schemas.openxmlformats.org/officeDocument/2006/math" xmlns:v="urn:schemas-microsoft-com:vml" xmlns:wp14="http://schemas.microsoft.com/office/word/2010/wordprocessingDrawing" xmlns:wp="http://schemas.openxmlformats.org/drawingml/2006/wordprocessingDrawing" xmlns:w10="urn:schemas-microsoft-com:office:word" xmlns:w="http://schemas.openxmlformats.org/wordprocessingml/2006/main" xmlns:w14="http://schemas.microsoft.com/office/word/2010/wordml" xmlns:w15="http://schemas.microsoft.com/office/word/2012/wordml" xmlns:w16cex="http://schemas.microsoft.com/office/word/2018/wordml/cex" xmlns:w16cid="http://schemas.microsoft.com/office/word/2016/wordml/cid" xmlns:w16="http://schemas.microsoft.com/office/word/2018/wordml" xmlns:w16du="http://schemas.microsoft.com/office/word/2023/wordml/word16du" xmlns:w16sdtdh="http://schemas.microsoft.com/office/word/2020/wordml/sdtdatahash" xmlns:w16sdtfl="http://schemas.microsoft.com/office/word/2024/wordml/sdtformatlock" xmlns:w16se="http://schemas.microsoft.com/office/word/2015/wordml/symex" xmlns:wpg="http://schemas.microsoft.com/office/word/2010/wordprocessingGroup" xmlns:wpi="http://schemas.microsoft.com/office/word/2010/wordprocessingInk" xmlns:wne="http://schemas.microsoft.com/office/word/2006/wordml" xmlns:wps="http://schemas.microsoft.com/office/word/2010/wordprocessingShape" mc:Ignorable="w14 w15 w16se w16cid w16 w16cex w16sdtdh w16sdtfl w16du wp14">
   <w:body>
     <w:p>
       <w:pPr>
@@ -24,9 +24,9 @@
       <w:r>
         <w:rPr>
           <w:b/>
-          <w:sz w:val="19"/>
-        </w:rPr>
-        <w:t>GIS &amp; Stormwater Network Specialist | InfraWizard Specialist | GOPP Expert Assistant | Infrastructure GIS</w:t>
+          <w:sz w:val="18"/>
+        </w:rPr>
+        <w:t>GIS &amp; Stormwater Network Specialist | Hydrological Draftsman | InfraWizard Specialist | GOPP Expert Assistant | Infrastructure GIS</w:t>
       </w:r>
     </w:p>
     <w:p>
@@ -580,6 +580,38 @@
     </w:p>
     <w:p>
       <w:pPr>
+        <w:keepLines/>
+        <w:spacing w:after="12"/>
+        <w:jc w:val="lowKashida"/>
+      </w:pPr>
+      <w:r>
+        <w:rPr>
+          <w:b/>
+        </w:rPr>
+        <w:t xml:space="preserve">• Geospatial Programming &amp; GIS Automation: </w:t>
+      </w:r>
+      <w:r>
+        <w:t>Python and ArcPy toolboxes for ArcMap / ArcGIS Pro; geoprocessing, climate-data workflows, cartographic automation, spatial data validation, and raster/vector outputs.</w:t>
+      </w:r>
+    </w:p>
+    <w:p>
+      <w:pPr>
+        <w:keepLines/>
+        <w:spacing w:after="12"/>
+        <w:jc w:val="lowKashida"/>
+      </w:pPr>
+      <w:r>
+        <w:rPr>
+          <w:b/>
+        </w:rPr>
+        <w:t xml:space="preserve">• Desktop, Mobile &amp; Web Software Development: </w:t>
+      </w:r>
+      <w:r>
+        <w:t>C# / WPF / .NET desktop utilities, Kotlin / Android GIS applications, HTML / CSS / JavaScript dashboards, Git/GitHub version control, and bilingual software documentation.</w:t>
+      </w:r>
+    </w:p>
+    <w:p>
+      <w:pPr>
         <w:pStyle w:val="Heading2"/>
       </w:pPr>
       <w:r>
@@ -632,14 +664,30 @@
     </w:p>
     <w:p>
       <w:pPr>
-        <w:pStyle w:val="Heading2"/>
-      </w:pPr>
-      <w:r>
-        <w:t>SOFTWARE TOOLS DEVELOPMENT (2026)</w:t>
+        <w:keepLines/>
+        <w:spacing w:after="12"/>
+        <w:jc w:val="lowKashida"/>
+      </w:pPr>
+      <w:r>
+        <w:rPr>
+          <w:b/>
+        </w:rPr>
+        <w:t xml:space="preserve">• Software Development Technologies: </w:t>
+      </w:r>
+      <w:r>
+        <w:t>Python / ArcPy, C# / .NET / WPF, Kotlin / Jetpack Compose, JavaScript / HTML / CSS, Git/GitHub, desktop installers, and GIS data services.</w:t>
       </w:r>
     </w:p>
     <w:p>
       <w:pPr>
+        <w:pStyle w:val="Heading2"/>
+      </w:pPr>
+      <w:r>
+        <w:t>SOFTWARE TOOLS DEVELOPMENT (2026)</w:t>
+      </w:r>
+    </w:p>
+    <w:p>
+      <w:pPr>
         <w:jc w:val="lowKashida"/>
         <w:rPr>
           <w:b/>
@@ -651,23 +699,7 @@
           <w:b/>
           <w:bCs/>
         </w:rPr>
-        <w:t xml:space="preserve">Developed a set of practical </w:t>
-      </w:r>
-      <w:proofErr w:type="gramStart"/>
-      <w:r>
-        <w:rPr>
-          <w:b/>
-          <w:bCs/>
-        </w:rPr>
-        <w:t>GIS</w:t>
-      </w:r>
-      <w:proofErr w:type="gramEnd"/>
-      <w:r>
-        <w:rPr>
-          <w:b/>
-          <w:bCs/>
-        </w:rPr>
-        <w:t>, CAD, PDF plotting, data transfer, and stormwater-network automation tools in 2026 to support mapping, infrastructure data preparation, file handling, and workflow improvement.</w:t>
+        <w:t>Developed a set of practical GIS, CAD, PDF plotting, data transfer, and stormwater-network automation tools in 2026 to support mapping, infrastructure data preparation, file handling, and workflow improvement.</w:t>
       </w:r>
     </w:p>
     <w:p>
@@ -759,55 +791,7 @@
         <w:rPr>
           <w:b/>
         </w:rPr>
-        <w:t xml:space="preserve"> GIS</w:t>
-      </w:r>
-      <w:r>
-        <w:rPr>
-          <w:b/>
-        </w:rPr>
-        <w:t xml:space="preserve"> </w:t>
-      </w:r>
-      <w:r>
-        <w:rPr>
-          <w:b/>
-        </w:rPr>
-        <w:t>Data</w:t>
-      </w:r>
-      <w:r>
-        <w:rPr>
-          <w:b/>
-        </w:rPr>
-        <w:t xml:space="preserve"> </w:t>
-      </w:r>
-      <w:r>
-        <w:rPr>
-          <w:b/>
-        </w:rPr>
-        <w:t>Repositories</w:t>
-      </w:r>
-      <w:r>
-        <w:rPr>
-          <w:b/>
-        </w:rPr>
-        <w:t xml:space="preserve"> </w:t>
-      </w:r>
-      <w:r>
-        <w:rPr>
-          <w:b/>
-        </w:rPr>
-        <w:t>Professional</w:t>
-      </w:r>
-      <w:r>
-        <w:rPr>
-          <w:b/>
-        </w:rPr>
-        <w:t xml:space="preserve"> </w:t>
-      </w:r>
-      <w:r>
-        <w:rPr>
-          <w:b/>
-        </w:rPr>
-        <w:t xml:space="preserve">2026: </w:t>
+        <w:t xml:space="preserve"> GIS Data Repositories Professional 2026: </w:t>
       </w:r>
       <w:r>
         <w:rPr>
@@ -1049,6 +1033,298 @@
           <w:b/>
         </w:rPr>
       </w:pPr>
+    </w:p>
+    <w:p>
+      <w:pPr>
+        <w:pStyle w:val="Heading2"/>
+        <w:pageBreakBefore/>
+      </w:pPr>
+      <w:r>
+        <w:lastRenderedPageBreak/>
+        <w:t>GIS, CLIMATE, GEOLOGY &amp; HYDROLOGY SOFTWARE (2026)</w:t>
+      </w:r>
+    </w:p>
+    <w:p>
+      <w:pPr>
+        <w:keepLines/>
+        <w:spacing w:after="12"/>
+        <w:jc w:val="lowKashida"/>
+      </w:pPr>
+      <w:r>
+        <w:rPr>
+          <w:b/>
+        </w:rPr>
+        <w:t xml:space="preserve">• MIRSAD - Meteorological Integrated Reanalysis Spatial Atlas Database: </w:t>
+      </w:r>
+      <w:r>
+        <w:t xml:space="preserve">Designed and developed a GIS climate-atlas platform with ArcGIS/ArcPy toolboxes and an independent desktop application under development; integrates meteorological station selection, climate sources, spatial outputs, rasters, and bilingual documentation.  |  </w:t>
+      </w:r>
+      <w:hyperlink r:id="rId8">
+        <w:r>
+          <w:rPr>
+            <w:color w:val="1F4E79"/>
+            <w:u w:val="single"/>
+          </w:rPr>
+          <w:t>GitHub</w:t>
+        </w:r>
+      </w:hyperlink>
+    </w:p>
+    <w:p>
+      <w:pPr>
+        <w:keepLines/>
+        <w:spacing w:after="12"/>
+        <w:jc w:val="lowKashida"/>
+      </w:pPr>
+      <w:r>
+        <w:rPr>
+          <w:b/>
+        </w:rPr>
+        <w:t xml:space="preserve">• GeoVision - Mobile GIS Viewer: </w:t>
+      </w:r>
+      <w:r>
+        <w:t xml:space="preserve">Developed an open-source Android GIS application in Kotlin to explore local geospatial datasets and maps, including Shapefile, GeoJSON, KML/KMZ, GeoPackage and GeoTIFF; Arabic/English interfaces and offline workflows.  |  </w:t>
+      </w:r>
+      <w:hyperlink r:id="rId9">
+        <w:r>
+          <w:rPr>
+            <w:color w:val="1F4E79"/>
+            <w:u w:val="single"/>
+          </w:rPr>
+          <w:t>GitHub</w:t>
+        </w:r>
+      </w:hyperlink>
+    </w:p>
+    <w:p>
+      <w:pPr>
+        <w:keepLines/>
+        <w:spacing w:after="12"/>
+        <w:jc w:val="lowKashida"/>
+      </w:pPr>
+      <w:r>
+        <w:rPr>
+          <w:b/>
+        </w:rPr>
+        <w:t xml:space="preserve">• Geological Cross-Section Toolbox for ArcGIS: </w:t>
+      </w:r>
+      <w:r>
+        <w:t xml:space="preserve">Developed an ArcMap / ArcGIS Pro Python toolbox for creating 2D geological and topographical cross-sections from geological outcrops, faults, and elevation models with cartographic export workflows.  |  </w:t>
+      </w:r>
+      <w:hyperlink r:id="rId10">
+        <w:r>
+          <w:rPr>
+            <w:color w:val="1F4E79"/>
+            <w:u w:val="single"/>
+          </w:rPr>
+          <w:t>GitHub</w:t>
+        </w:r>
+      </w:hyperlink>
+    </w:p>
+    <w:p>
+      <w:pPr>
+        <w:keepLines/>
+        <w:spacing w:after="12"/>
+        <w:jc w:val="lowKashida"/>
+      </w:pPr>
+      <w:r>
+        <w:rPr>
+          <w:b/>
+        </w:rPr>
+        <w:t xml:space="preserve">• CreateFlowArrow - Gravity Networks Toolbox: </w:t>
+      </w:r>
+      <w:r>
+        <w:t xml:space="preserve">Developed an ArcGIS Python toolbox to create pipe-flow direction arrows and assist GIS QA/QC of stormwater, sewer and groundwater gravity networks, including slope/invert orientation and digitizing-direction checks.  |  </w:t>
+      </w:r>
+      <w:hyperlink r:id="rId11">
+        <w:r>
+          <w:rPr>
+            <w:color w:val="1F4E79"/>
+            <w:u w:val="single"/>
+          </w:rPr>
+          <w:t>GitHub</w:t>
+        </w:r>
+      </w:hyperlink>
+    </w:p>
+    <w:p>
+      <w:pPr>
+        <w:keepLines/>
+        <w:spacing w:after="12"/>
+        <w:jc w:val="lowKashida"/>
+      </w:pPr>
+      <w:r>
+        <w:rPr>
+          <w:b/>
+        </w:rPr>
+        <w:t xml:space="preserve">• Storm Drainage Calculation Dashboard: </w:t>
+      </w:r>
+      <w:r>
+        <w:t xml:space="preserve">Developed a browser-based dashboard for preliminary hydrology and drainage calculations, including IDF relationships, SCS Curve Number runoff, design rainfall patterns, Rational Method estimates, charts, and export workflows.  |  </w:t>
+      </w:r>
+      <w:hyperlink r:id="rId12">
+        <w:r>
+          <w:rPr>
+            <w:color w:val="1F4E79"/>
+            <w:u w:val="single"/>
+          </w:rPr>
+          <w:t>GitHub</w:t>
+        </w:r>
+      </w:hyperlink>
+    </w:p>
+    <w:p>
+      <w:pPr>
+        <w:keepLines/>
+        <w:spacing w:after="12"/>
+        <w:jc w:val="lowKashida"/>
+      </w:pPr>
+      <w:r>
+        <w:rPr>
+          <w:b/>
+        </w:rPr>
+        <w:t xml:space="preserve">• ArcMap Style Collection: </w:t>
+      </w:r>
+      <w:r>
+        <w:t xml:space="preserve">Organized and published a searchable, bilingual GIS symbology and cartographic-style library for ArcMap and ArcGIS Pro, covering geology, hydrology, soils, transportation, color ramps, and specialized mapping standards.  |  </w:t>
+      </w:r>
+      <w:hyperlink r:id="rId13">
+        <w:r>
+          <w:rPr>
+            <w:color w:val="1F4E79"/>
+            <w:u w:val="single"/>
+          </w:rPr>
+          <w:t>GitHub</w:t>
+        </w:r>
+      </w:hyperlink>
+    </w:p>
+    <w:p>
+      <w:pPr>
+        <w:pStyle w:val="Heading2"/>
+      </w:pPr>
+      <w:r>
+        <w:t>OTHER DEVELOPED DESKTOP, MOBILE &amp; WEB APPLICATIONS (2026)</w:t>
+      </w:r>
+    </w:p>
+    <w:p>
+      <w:pPr>
+        <w:keepLines/>
+        <w:spacing w:after="12"/>
+        <w:jc w:val="lowKashida"/>
+      </w:pPr>
+      <w:r>
+        <w:rPr>
+          <w:b/>
+        </w:rPr>
+        <w:t xml:space="preserve">• SmartPhotoOrganizer: </w:t>
+      </w:r>
+      <w:r>
+        <w:t xml:space="preserve">Developed a Windows WPF/.NET photo-organization tool for EXIF/GPS metadata review, duplicate detection, image quality assessment, bulk renaming, and map-based visualization.  |  </w:t>
+      </w:r>
+      <w:hyperlink r:id="rId14">
+        <w:r>
+          <w:rPr>
+            <w:color w:val="1F4E79"/>
+            <w:u w:val="single"/>
+          </w:rPr>
+          <w:t>GitHub</w:t>
+        </w:r>
+      </w:hyperlink>
+    </w:p>
+    <w:p>
+      <w:pPr>
+        <w:keepLines/>
+        <w:spacing w:after="12"/>
+        <w:jc w:val="lowKashida"/>
+      </w:pPr>
+      <w:r>
+        <w:rPr>
+          <w:b/>
+        </w:rPr>
+        <w:t xml:space="preserve">• Charge Alert (Android): </w:t>
+      </w:r>
+      <w:r>
+        <w:t xml:space="preserve">Developed a Kotlin/Jetpack Compose mobile app for battery-level monitoring and target-charge alerts, with Arabic/English interfaces and configurable charging visualization themes.  |  </w:t>
+      </w:r>
+      <w:hyperlink r:id="rId15">
+        <w:r>
+          <w:rPr>
+            <w:color w:val="1F4E79"/>
+            <w:u w:val="single"/>
+          </w:rPr>
+          <w:t>GitHub</w:t>
+        </w:r>
+      </w:hyperlink>
+    </w:p>
+    <w:p>
+      <w:pPr>
+        <w:keepLines/>
+        <w:spacing w:after="12"/>
+        <w:jc w:val="lowKashida"/>
+      </w:pPr>
+      <w:r>
+        <w:rPr>
+          <w:b/>
+        </w:rPr>
+        <w:t xml:space="preserve">• FitraShield - Browser Safety Extension: </w:t>
+      </w:r>
+      <w:r>
+        <w:t xml:space="preserve">Designed a privacy-oriented browser extension for local content filtering and parental safety controls, including configurable blocking and bilingual documentation.  |  </w:t>
+      </w:r>
+      <w:hyperlink r:id="rId16">
+        <w:r>
+          <w:rPr>
+            <w:color w:val="1F4E79"/>
+            <w:u w:val="single"/>
+          </w:rPr>
+          <w:t>GitHub</w:t>
+        </w:r>
+      </w:hyperlink>
+    </w:p>
+    <w:p>
+      <w:pPr>
+        <w:keepLines/>
+        <w:spacing w:after="12"/>
+        <w:jc w:val="lowKashida"/>
+      </w:pPr>
+      <w:r>
+        <w:rPr>
+          <w:b/>
+        </w:rPr>
+        <w:t xml:space="preserve">• Ahmad Ibrahim Portfolio &amp; Interactive CV: </w:t>
+      </w:r>
+      <w:r>
+        <w:t xml:space="preserve">Developed a responsive English/Arabic professional portfolio and interactive online CV covering engineering projects, registered atlases, publications, professional capabilities, and software products.  |  </w:t>
+      </w:r>
+      <w:hyperlink r:id="rId17">
+        <w:r>
+          <w:rPr>
+            <w:color w:val="1F4E79"/>
+            <w:u w:val="single"/>
+          </w:rPr>
+          <w:t>GitHub</w:t>
+        </w:r>
+      </w:hyperlink>
+    </w:p>
+    <w:p>
+      <w:pPr>
+        <w:pStyle w:val="Heading2"/>
+      </w:pPr>
+      <w:r>
+        <w:t>CURRENT DEVELOPMENT / IN-PROGRESS APPLICATIONS</w:t>
+      </w:r>
+    </w:p>
+    <w:p>
+      <w:pPr>
+        <w:keepLines/>
+        <w:spacing w:after="12"/>
+        <w:jc w:val="lowKashida"/>
+      </w:pPr>
+      <w:r>
+        <w:rPr>
+          <w:b/>
+        </w:rPr>
+        <w:t xml:space="preserve">• Z Earth Desktop: </w:t>
+      </w:r>
+      <w:r>
+        <w:t>In-development standalone desktop GIS / virtual-globe application concept with KML/KMZ workflows, Places/Layers management, mapping, navigation, and 2D/3D visualization. Work in progress; not presented as a released product.</w:t>
+      </w:r>
     </w:p>
     <w:p>
       <w:pPr>
@@ -1153,7 +1429,6 @@
         <w:rPr>
           <w:b/>
         </w:rPr>
-        <w:lastRenderedPageBreak/>
         <w:t xml:space="preserve">• </w:t>
       </w:r>
       <w:r>
@@ -1456,6 +1731,7 @@
     <w:p>
       <w:pPr>
         <w:pStyle w:val="Heading2"/>
+        <w:pageBreakBefore/>
         <w:pBdr>
           <w:bottom w:val="single" w:sz="4" w:space="1" w:color="C8D6E5"/>
         </w:pBdr>
@@ -1464,6 +1740,7 @@
         <w:rPr>
           <w:rFonts w:ascii="Calibri" w:eastAsia="Calibri" w:hAnsi="Calibri"/>
         </w:rPr>
+        <w:lastRenderedPageBreak/>
         <w:t>PUBLICATIONS &amp; SCIENTIFIC CONTRIBUTIONS</w:t>
       </w:r>
     </w:p>
@@ -1830,7 +2107,7 @@
       </w:r>
     </w:p>
     <w:sectPr>
-      <w:footerReference w:type="default" r:id="rId8"/>
+      <w:footerReference w:type="default" r:id="rId18"/>
       <w:pgSz w:w="12240" w:h="15840"/>
       <w:pgMar w:top="595" w:right="709" w:bottom="595" w:left="709" w:header="720" w:footer="720" w:gutter="0"/>
       <w:cols w:space="720"/>
@@ -1841,7 +2118,7 @@
 </file>
 
 <file path=word/endnotes.xml><?xml version="1.0" encoding="utf-8"?>
-<w:endnotes xmlns:wpc="http://schemas.microsoft.com/office/word/2010/wordprocessingCanvas" xmlns:cx="http://schemas.microsoft.com/office/drawing/2014/chartex" xmlns:cx1="http://schemas.microsoft.com/office/drawing/2015/9/8/chartex" xmlns:cx2="http://schemas.microsoft.com/office/drawing/2015/10/21/chartex" xmlns:cx3="http://schemas.microsoft.com/office/drawing/2016/5/9/chartex" xmlns:cx4="http://schemas.microsoft.com/office/drawing/2016/5/10/chartex" xmlns:cx5="http://schemas.microsoft.com/office/drawing/2016/5/11/chartex" xmlns:cx6="http://schemas.microsoft.com/office/drawing/2016/5/12/chartex" xmlns:cx7="http://schemas.microsoft.com/office/drawing/2016/5/13/chartex" xmlns:cx8="http://schemas.microsoft.com/office/drawing/2016/5/14/chartex" xmlns:mc="http://schemas.openxmlformats.org/markup-compatibility/2006" xmlns:aink="http://schemas.microsoft.com/office/drawing/2016/ink" xmlns:am3d="http://schemas.microsoft.com/office/drawing/2017/model3d" xmlns:o="urn:schemas-microsoft-com:office:office" xmlns:oel="http://schemas.microsoft.com/office/2019/extlst" xmlns:r="http://schemas.openxmlformats.org/officeDocument/2006/relationships" xmlns:m="http://schemas.openxmlformats.org/officeDocument/2006/math" xmlns:v="urn:schemas-microsoft-com:vml" xmlns:wp14="http://schemas.microsoft.com/office/word/2010/wordprocessingDrawing" xmlns:wp="http://schemas.openxmlformats.org/drawingml/2006/wordprocessingDrawing" xmlns:w10="urn:schemas-microsoft-com:office:word" xmlns:w="http://schemas.openxmlformats.org/wordprocessingml/2006/main" xmlns:w14="http://schemas.microsoft.com/office/word/2010/wordml" xmlns:w15="http://schemas.microsoft.com/office/word/2012/wordml" xmlns:w16cex="http://schemas.microsoft.com/office/word/2018/wordml/cex" xmlns:w16cid="http://schemas.microsoft.com/office/word/2016/wordml/cid" xmlns:w16="http://schemas.microsoft.com/office/word/2018/wordml" xmlns:w16sdtdh="http://schemas.microsoft.com/office/word/2020/wordml/sdtdatahash" xmlns:w16se="http://schemas.microsoft.com/office/word/2015/wordml/symex" xmlns:wpg="http://schemas.microsoft.com/office/word/2010/wordprocessingGroup" xmlns:wpi="http://schemas.microsoft.com/office/word/2010/wordprocessingInk" xmlns:wne="http://schemas.microsoft.com/office/word/2006/wordml" xmlns:wps="http://schemas.microsoft.com/office/word/2010/wordprocessingShape" mc:Ignorable="w14 w15 w16se w16cid w16 w16cex w16sdtdh wp14">
+<w:endnotes xmlns:wpc="http://schemas.microsoft.com/office/word/2010/wordprocessingCanvas" xmlns:cx="http://schemas.microsoft.com/office/drawing/2014/chartex" xmlns:cx1="http://schemas.microsoft.com/office/drawing/2015/9/8/chartex" xmlns:cx2="http://schemas.microsoft.com/office/drawing/2015/10/21/chartex" xmlns:cx3="http://schemas.microsoft.com/office/drawing/2016/5/9/chartex" xmlns:cx4="http://schemas.microsoft.com/office/drawing/2016/5/10/chartex" xmlns:cx5="http://schemas.microsoft.com/office/drawing/2016/5/11/chartex" xmlns:cx6="http://schemas.microsoft.com/office/drawing/2016/5/12/chartex" xmlns:cx7="http://schemas.microsoft.com/office/drawing/2016/5/13/chartex" xmlns:cx8="http://schemas.microsoft.com/office/drawing/2016/5/14/chartex" xmlns:mc="http://schemas.openxmlformats.org/markup-compatibility/2006" xmlns:aink="http://schemas.microsoft.com/office/drawing/2016/ink" xmlns:am3d="http://schemas.microsoft.com/office/drawing/2017/model3d" xmlns:o="urn:schemas-microsoft-com:office:office" xmlns:oel="http://schemas.microsoft.com/office/2019/extlst" xmlns:r="http://schemas.openxmlformats.org/officeDocument/2006/relationships" xmlns:m="http://schemas.openxmlformats.org/officeDocument/2006/math" xmlns:v="urn:schemas-microsoft-com:vml" xmlns:wp14="http://schemas.microsoft.com/office/word/2010/wordprocessingDrawing" xmlns:wp="http://schemas.openxmlformats.org/drawingml/2006/wordprocessingDrawing" xmlns:w10="urn:schemas-microsoft-com:office:word" xmlns:w="http://schemas.openxmlformats.org/wordprocessingml/2006/main" xmlns:w14="http://schemas.microsoft.com/office/word/2010/wordml" xmlns:w15="http://schemas.microsoft.com/office/word/2012/wordml" xmlns:w16cex="http://schemas.microsoft.com/office/word/2018/wordml/cex" xmlns:w16cid="http://schemas.microsoft.com/office/word/2016/wordml/cid" xmlns:w16="http://schemas.microsoft.com/office/word/2018/wordml" xmlns:w16du="http://schemas.microsoft.com/office/word/2023/wordml/word16du" xmlns:w16sdtdh="http://schemas.microsoft.com/office/word/2020/wordml/sdtdatahash" xmlns:w16sdtfl="http://schemas.microsoft.com/office/word/2024/wordml/sdtformatlock" xmlns:w16se="http://schemas.microsoft.com/office/word/2015/wordml/symex" xmlns:wpg="http://schemas.microsoft.com/office/word/2010/wordprocessingGroup" xmlns:wpi="http://schemas.microsoft.com/office/word/2010/wordprocessingInk" xmlns:wne="http://schemas.microsoft.com/office/word/2006/wordml" xmlns:wps="http://schemas.microsoft.com/office/word/2010/wordprocessingShape" mc:Ignorable="w14 w15 w16se w16cid w16 w16cex w16sdtdh w16sdtfl w16du wp14">
   <w:endnote w:type="separator" w:id="-1">
     <w:p>
       <w:pPr>
@@ -1866,7 +2143,7 @@
 </file>
 
 <file path=word/footer1.xml><?xml version="1.0" encoding="utf-8"?>
-<w:ftr xmlns:wpc="http://schemas.microsoft.com/office/word/2010/wordprocessingCanvas" xmlns:cx="http://schemas.microsoft.com/office/drawing/2014/chartex" xmlns:cx1="http://schemas.microsoft.com/office/drawing/2015/9/8/chartex" xmlns:cx2="http://schemas.microsoft.com/office/drawing/2015/10/21/chartex" xmlns:cx3="http://schemas.microsoft.com/office/drawing/2016/5/9/chartex" xmlns:cx4="http://schemas.microsoft.com/office/drawing/2016/5/10/chartex" xmlns:cx5="http://schemas.microsoft.com/office/drawing/2016/5/11/chartex" xmlns:cx6="http://schemas.microsoft.com/office/drawing/2016/5/12/chartex" xmlns:cx7="http://schemas.microsoft.com/office/drawing/2016/5/13/chartex" xmlns:cx8="http://schemas.microsoft.com/office/drawing/2016/5/14/chartex" xmlns:mc="http://schemas.openxmlformats.org/markup-compatibility/2006" xmlns:aink="http://schemas.microsoft.com/office/drawing/2016/ink" xmlns:am3d="http://schemas.microsoft.com/office/drawing/2017/model3d" xmlns:o="urn:schemas-microsoft-com:office:office" xmlns:oel="http://schemas.microsoft.com/office/2019/extlst" xmlns:r="http://schemas.openxmlformats.org/officeDocument/2006/relationships" xmlns:m="http://schemas.openxmlformats.org/officeDocument/2006/math" xmlns:v="urn:schemas-microsoft-com:vml" xmlns:wp14="http://schemas.microsoft.com/office/word/2010/wordprocessingDrawing" xmlns:wp="http://schemas.openxmlformats.org/drawingml/2006/wordprocessingDrawing" xmlns:w10="urn:schemas-microsoft-com:office:word" xmlns:w="http://schemas.openxmlformats.org/wordprocessingml/2006/main" xmlns:w14="http://schemas.microsoft.com/office/word/2010/wordml" xmlns:w15="http://schemas.microsoft.com/office/word/2012/wordml" xmlns:w16cex="http://schemas.microsoft.com/office/word/2018/wordml/cex" xmlns:w16cid="http://schemas.microsoft.com/office/word/2016/wordml/cid" xmlns:w16="http://schemas.microsoft.com/office/word/2018/wordml" xmlns:w16sdtdh="http://schemas.microsoft.com/office/word/2020/wordml/sdtdatahash" xmlns:w16se="http://schemas.microsoft.com/office/word/2015/wordml/symex" xmlns:wpg="http://schemas.microsoft.com/office/word/2010/wordprocessingGroup" xmlns:wpi="http://schemas.microsoft.com/office/word/2010/wordprocessingInk" xmlns:wne="http://schemas.microsoft.com/office/word/2006/wordml" xmlns:wps="http://schemas.microsoft.com/office/word/2010/wordprocessingShape" mc:Ignorable="w14 w15 w16se w16cid w16 w16cex w16sdtdh wp14">
+<w:ftr xmlns:wpc="http://schemas.microsoft.com/office/word/2010/wordprocessingCanvas" xmlns:cx="http://schemas.microsoft.com/office/drawing/2014/chartex" xmlns:cx1="http://schemas.microsoft.com/office/drawing/2015/9/8/chartex" xmlns:cx2="http://schemas.microsoft.com/office/drawing/2015/10/21/chartex" xmlns:cx3="http://schemas.microsoft.com/office/drawing/2016/5/9/chartex" xmlns:cx4="http://schemas.microsoft.com/office/drawing/2016/5/10/chartex" xmlns:cx5="http://schemas.microsoft.com/office/drawing/2016/5/11/chartex" xmlns:cx6="http://schemas.microsoft.com/office/drawing/2016/5/12/chartex" xmlns:cx7="http://schemas.microsoft.com/office/drawing/2016/5/13/chartex" xmlns:cx8="http://schemas.microsoft.com/office/drawing/2016/5/14/chartex" xmlns:mc="http://schemas.openxmlformats.org/markup-compatibility/2006" xmlns:aink="http://schemas.microsoft.com/office/drawing/2016/ink" xmlns:am3d="http://schemas.microsoft.com/office/drawing/2017/model3d" xmlns:o="urn:schemas-microsoft-com:office:office" xmlns:oel="http://schemas.microsoft.com/office/2019/extlst" xmlns:r="http://schemas.openxmlformats.org/officeDocument/2006/relationships" xmlns:m="http://schemas.openxmlformats.org/officeDocument/2006/math" xmlns:v="urn:schemas-microsoft-com:vml" xmlns:wp14="http://schemas.microsoft.com/office/word/2010/wordprocessingDrawing" xmlns:wp="http://schemas.openxmlformats.org/drawingml/2006/wordprocessingDrawing" xmlns:w10="urn:schemas-microsoft-com:office:word" xmlns:w="http://schemas.openxmlformats.org/wordprocessingml/2006/main" xmlns:w14="http://schemas.microsoft.com/office/word/2010/wordml" xmlns:w15="http://schemas.microsoft.com/office/word/2012/wordml" xmlns:w16cex="http://schemas.microsoft.com/office/word/2018/wordml/cex" xmlns:w16cid="http://schemas.microsoft.com/office/word/2016/wordml/cid" xmlns:w16="http://schemas.microsoft.com/office/word/2018/wordml" xmlns:w16du="http://schemas.microsoft.com/office/word/2023/wordml/word16du" xmlns:w16sdtdh="http://schemas.microsoft.com/office/word/2020/wordml/sdtdatahash" xmlns:w16sdtfl="http://schemas.microsoft.com/office/word/2024/wordml/sdtformatlock" xmlns:w16se="http://schemas.microsoft.com/office/word/2015/wordml/symex" xmlns:wpg="http://schemas.microsoft.com/office/word/2010/wordprocessingGroup" xmlns:wpi="http://schemas.microsoft.com/office/word/2010/wordprocessingInk" xmlns:wne="http://schemas.microsoft.com/office/word/2006/wordml" xmlns:wps="http://schemas.microsoft.com/office/word/2010/wordprocessingShape" mc:Ignorable="w14 w15 w16se w16cid w16 w16cex w16sdtdh w16sdtfl w16du wp14">
   <w:p>
     <w:pPr>
       <w:pStyle w:val="Footer"/>
@@ -1884,7 +2161,7 @@
 </file>
 
 <file path=word/footnotes.xml><?xml version="1.0" encoding="utf-8"?>
-<w:footnotes xmlns:wpc="http://schemas.microsoft.com/office/word/2010/wordprocessingCanvas" xmlns:cx="http://schemas.microsoft.com/office/drawing/2014/chartex" xmlns:cx1="http://schemas.microsoft.com/office/drawing/2015/9/8/chartex" xmlns:cx2="http://schemas.microsoft.com/office/drawing/2015/10/21/chartex" xmlns:cx3="http://schemas.microsoft.com/office/drawing/2016/5/9/chartex" xmlns:cx4="http://schemas.microsoft.com/office/drawing/2016/5/10/chartex" xmlns:cx5="http://schemas.microsoft.com/office/drawing/2016/5/11/chartex" xmlns:cx6="http://schemas.microsoft.com/office/drawing/2016/5/12/chartex" xmlns:cx7="http://schemas.microsoft.com/office/drawing/2016/5/13/chartex" xmlns:cx8="http://schemas.microsoft.com/office/drawing/2016/5/14/chartex" xmlns:mc="http://schemas.openxmlformats.org/markup-compatibility/2006" xmlns:aink="http://schemas.microsoft.com/office/drawing/2016/ink" xmlns:am3d="http://schemas.microsoft.com/office/drawing/2017/model3d" xmlns:o="urn:schemas-microsoft-com:office:office" xmlns:oel="http://schemas.microsoft.com/office/2019/extlst" xmlns:r="http://schemas.openxmlformats.org/officeDocument/2006/relationships" xmlns:m="http://schemas.openxmlformats.org/officeDocument/2006/math" xmlns:v="urn:schemas-microsoft-com:vml" xmlns:wp14="http://schemas.microsoft.com/office/word/2010/wordprocessingDrawing" xmlns:wp="http://schemas.openxmlformats.org/drawingml/2006/wordprocessingDrawing" xmlns:w10="urn:schemas-microsoft-com:office:word" xmlns:w="http://schemas.openxmlformats.org/wordprocessingml/2006/main" xmlns:w14="http://schemas.microsoft.com/office/word/2010/wordml" xmlns:w15="http://schemas.microsoft.com/office/word/2012/wordml" xmlns:w16cex="http://schemas.microsoft.com/office/word/2018/wordml/cex" xmlns:w16cid="http://schemas.microsoft.com/office/word/2016/wordml/cid" xmlns:w16="http://schemas.microsoft.com/office/word/2018/wordml" xmlns:w16sdtdh="http://schemas.microsoft.com/office/word/2020/wordml/sdtdatahash" xmlns:w16se="http://schemas.microsoft.com/office/word/2015/wordml/symex" xmlns:wpg="http://schemas.microsoft.com/office/word/2010/wordprocessingGroup" xmlns:wpi="http://schemas.microsoft.com/office/word/2010/wordprocessingInk" xmlns:wne="http://schemas.microsoft.com/office/word/2006/wordml" xmlns:wps="http://schemas.microsoft.com/office/word/2010/wordprocessingShape" mc:Ignorable="w14 w15 w16se w16cid w16 w16cex w16sdtdh wp14">
+<w:footnotes xmlns:wpc="http://schemas.microsoft.com/office/word/2010/wordprocessingCanvas" xmlns:cx="http://schemas.microsoft.com/office/drawing/2014/chartex" xmlns:cx1="http://schemas.microsoft.com/office/drawing/2015/9/8/chartex" xmlns:cx2="http://schemas.microsoft.com/office/drawing/2015/10/21/chartex" xmlns:cx3="http://schemas.microsoft.com/office/drawing/2016/5/9/chartex" xmlns:cx4="http://schemas.microsoft.com/office/drawing/2016/5/10/chartex" xmlns:cx5="http://schemas.microsoft.com/office/drawing/2016/5/11/chartex" xmlns:cx6="http://schemas.microsoft.com/office/drawing/2016/5/12/chartex" xmlns:cx7="http://schemas.microsoft.com/office/drawing/2016/5/13/chartex" xmlns:cx8="http://schemas.microsoft.com/office/drawing/2016/5/14/chartex" xmlns:mc="http://schemas.openxmlformats.org/markup-compatibility/2006" xmlns:aink="http://schemas.microsoft.com/office/drawing/2016/ink" xmlns:am3d="http://schemas.microsoft.com/office/drawing/2017/model3d" xmlns:o="urn:schemas-microsoft-com:office:office" xmlns:oel="http://schemas.microsoft.com/office/2019/extlst" xmlns:r="http://schemas.openxmlformats.org/officeDocument/2006/relationships" xmlns:m="http://schemas.openxmlformats.org/officeDocument/2006/math" xmlns:v="urn:schemas-microsoft-com:vml" xmlns:wp14="http://schemas.microsoft.com/office/word/2010/wordprocessingDrawing" xmlns:wp="http://schemas.openxmlformats.org/drawingml/2006/wordprocessingDrawing" xmlns:w10="urn:schemas-microsoft-com:office:word" xmlns:w="http://schemas.openxmlformats.org/wordprocessingml/2006/main" xmlns:w14="http://schemas.microsoft.com/office/word/2010/wordml" xmlns:w15="http://schemas.microsoft.com/office/word/2012/wordml" xmlns:w16cex="http://schemas.microsoft.com/office/word/2018/wordml/cex" xmlns:w16cid="http://schemas.microsoft.com/office/word/2016/wordml/cid" xmlns:w16="http://schemas.microsoft.com/office/word/2018/wordml" xmlns:w16du="http://schemas.microsoft.com/office/word/2023/wordml/word16du" xmlns:w16sdtdh="http://schemas.microsoft.com/office/word/2020/wordml/sdtdatahash" xmlns:w16sdtfl="http://schemas.microsoft.com/office/word/2024/wordml/sdtformatlock" xmlns:w16se="http://schemas.microsoft.com/office/word/2015/wordml/symex" xmlns:wpg="http://schemas.microsoft.com/office/word/2010/wordprocessingGroup" xmlns:wpi="http://schemas.microsoft.com/office/word/2010/wordprocessingInk" xmlns:wne="http://schemas.microsoft.com/office/word/2006/wordml" xmlns:wps="http://schemas.microsoft.com/office/word/2010/wordprocessingShape" mc:Ignorable="w14 w15 w16se w16cid w16 w16cex w16sdtdh w16sdtfl w16du wp14">
   <w:footnote w:type="separator" w:id="-1">
     <w:p>
       <w:pPr>
@@ -1909,7 +2186,7 @@
 </file>
 
 <file path=word/numbering.xml><?xml version="1.0" encoding="utf-8"?>
-<w:numbering xmlns:wpc="http://schemas.microsoft.com/office/word/2010/wordprocessingCanvas" xmlns:cx="http://schemas.microsoft.com/office/drawing/2014/chartex" xmlns:cx1="http://schemas.microsoft.com/office/drawing/2015/9/8/chartex" xmlns:cx2="http://schemas.microsoft.com/office/drawing/2015/10/21/chartex" xmlns:cx3="http://schemas.microsoft.com/office/drawing/2016/5/9/chartex" xmlns:cx4="http://schemas.microsoft.com/office/drawing/2016/5/10/chartex" xmlns:cx5="http://schemas.microsoft.com/office/drawing/2016/5/11/chartex" xmlns:cx6="http://schemas.microsoft.com/office/drawing/2016/5/12/chartex" xmlns:cx7="http://schemas.microsoft.com/office/drawing/2016/5/13/chartex" xmlns:cx8="http://schemas.microsoft.com/office/drawing/2016/5/14/chartex" xmlns:mc="http://schemas.openxmlformats.org/markup-compatibility/2006" xmlns:aink="http://schemas.microsoft.com/office/drawing/2016/ink" xmlns:am3d="http://schemas.microsoft.com/office/drawing/2017/model3d" xmlns:o="urn:schemas-microsoft-com:office:office" xmlns:oel="http://schemas.microsoft.com/office/2019/extlst" xmlns:r="http://schemas.openxmlformats.org/officeDocument/2006/relationships" xmlns:m="http://schemas.openxmlformats.org/officeDocument/2006/math" xmlns:v="urn:schemas-microsoft-com:vml" xmlns:wp14="http://schemas.microsoft.com/office/word/2010/wordprocessingDrawing" xmlns:wp="http://schemas.openxmlformats.org/drawingml/2006/wordprocessingDrawing" xmlns:w10="urn:schemas-microsoft-com:office:word" xmlns:w="http://schemas.openxmlformats.org/wordprocessingml/2006/main" xmlns:w14="http://schemas.microsoft.com/office/word/2010/wordml" xmlns:w15="http://schemas.microsoft.com/office/word/2012/wordml" xmlns:w16cex="http://schemas.microsoft.com/office/word/2018/wordml/cex" xmlns:w16cid="http://schemas.microsoft.com/office/word/2016/wordml/cid" xmlns:w16="http://schemas.microsoft.com/office/word/2018/wordml" xmlns:w16sdtdh="http://schemas.microsoft.com/office/word/2020/wordml/sdtdatahash" xmlns:w16se="http://schemas.microsoft.com/office/word/2015/wordml/symex" xmlns:wpg="http://schemas.microsoft.com/office/word/2010/wordprocessingGroup" xmlns:wpi="http://schemas.microsoft.com/office/word/2010/wordprocessingInk" xmlns:wne="http://schemas.microsoft.com/office/word/2006/wordml" xmlns:wps="http://schemas.microsoft.com/office/word/2010/wordprocessingShape" mc:Ignorable="w14 w15 w16se w16cid w16 w16cex w16sdtdh wp14">
+<w:numbering xmlns:wpc="http://schemas.microsoft.com/office/word/2010/wordprocessingCanvas" xmlns:cx="http://schemas.microsoft.com/office/drawing/2014/chartex" xmlns:cx1="http://schemas.microsoft.com/office/drawing/2015/9/8/chartex" xmlns:cx2="http://schemas.microsoft.com/office/drawing/2015/10/21/chartex" xmlns:cx3="http://schemas.microsoft.com/office/drawing/2016/5/9/chartex" xmlns:cx4="http://schemas.microsoft.com/office/drawing/2016/5/10/chartex" xmlns:cx5="http://schemas.microsoft.com/office/drawing/2016/5/11/chartex" xmlns:cx6="http://schemas.microsoft.com/office/drawing/2016/5/12/chartex" xmlns:cx7="http://schemas.microsoft.com/office/drawing/2016/5/13/chartex" xmlns:cx8="http://schemas.microsoft.com/office/drawing/2016/5/14/chartex" xmlns:mc="http://schemas.openxmlformats.org/markup-compatibility/2006" xmlns:aink="http://schemas.microsoft.com/office/drawing/2016/ink" xmlns:am3d="http://schemas.microsoft.com/office/drawing/2017/model3d" xmlns:o="urn:schemas-microsoft-com:office:office" xmlns:oel="http://schemas.microsoft.com/office/2019/extlst" xmlns:r="http://schemas.openxmlformats.org/officeDocument/2006/relationships" xmlns:m="http://schemas.openxmlformats.org/officeDocument/2006/math" xmlns:v="urn:schemas-microsoft-com:vml" xmlns:wp14="http://schemas.microsoft.com/office/word/2010/wordprocessingDrawing" xmlns:wp="http://schemas.openxmlformats.org/drawingml/2006/wordprocessingDrawing" xmlns:w10="urn:schemas-microsoft-com:office:word" xmlns:w="http://schemas.openxmlformats.org/wordprocessingml/2006/main" xmlns:w14="http://schemas.microsoft.com/office/word/2010/wordml" xmlns:w15="http://schemas.microsoft.com/office/word/2012/wordml" xmlns:w16cex="http://schemas.microsoft.com/office/word/2018/wordml/cex" xmlns:w16cid="http://schemas.microsoft.com/office/word/2016/wordml/cid" xmlns:w16="http://schemas.microsoft.com/office/word/2018/wordml" xmlns:w16du="http://schemas.microsoft.com/office/word/2023/wordml/word16du" xmlns:w16sdtdh="http://schemas.microsoft.com/office/word/2020/wordml/sdtdatahash" xmlns:w16sdtfl="http://schemas.microsoft.com/office/word/2024/wordml/sdtformatlock" xmlns:w16se="http://schemas.microsoft.com/office/word/2015/wordml/symex" xmlns:wpg="http://schemas.microsoft.com/office/word/2010/wordprocessingGroup" xmlns:wpi="http://schemas.microsoft.com/office/word/2010/wordprocessingInk" xmlns:wne="http://schemas.microsoft.com/office/word/2006/wordml" xmlns:wps="http://schemas.microsoft.com/office/word/2010/wordprocessingShape" mc:Ignorable="w14 w15 w16se w16cid w16 w16cex w16sdtdh w16sdtfl w16du wp14">
   <w:abstractNum w:abstractNumId="0" w15:restartNumberingAfterBreak="0">
     <w:nsid w:val="FFFFFF7C"/>
     <w:multiLevelType w:val="singleLevel"/>
@@ -2112,7 +2389,7 @@
 </file>
 
 <file path=word/styles.xml><?xml version="1.0" encoding="utf-8"?>
-<w:styles xmlns:mc="http://schemas.openxmlformats.org/markup-compatibility/2006" xmlns:r="http://schemas.openxmlformats.org/officeDocument/2006/relationships" xmlns:w="http://schemas.openxmlformats.org/wordprocessingml/2006/main" xmlns:w14="http://schemas.microsoft.com/office/word/2010/wordml" xmlns:w15="http://schemas.microsoft.com/office/word/2012/wordml" xmlns:w16cex="http://schemas.microsoft.com/office/word/2018/wordml/cex" xmlns:w16cid="http://schemas.microsoft.com/office/word/2016/wordml/cid" xmlns:w16="http://schemas.microsoft.com/office/word/2018/wordml" xmlns:w16sdtdh="http://schemas.microsoft.com/office/word/2020/wordml/sdtdatahash" xmlns:w16se="http://schemas.microsoft.com/office/word/2015/wordml/symex" mc:Ignorable="w14 w15 w16se w16cid w16 w16cex w16sdtdh">
+<w:styles xmlns:mc="http://schemas.openxmlformats.org/markup-compatibility/2006" xmlns:r="http://schemas.openxmlformats.org/officeDocument/2006/relationships" xmlns:w="http://schemas.openxmlformats.org/wordprocessingml/2006/main" xmlns:w14="http://schemas.microsoft.com/office/word/2010/wordml" xmlns:w15="http://schemas.microsoft.com/office/word/2012/wordml" xmlns:w16cex="http://schemas.microsoft.com/office/word/2018/wordml/cex" xmlns:w16cid="http://schemas.microsoft.com/office/word/2016/wordml/cid" xmlns:w16="http://schemas.microsoft.com/office/word/2018/wordml" xmlns:w16du="http://schemas.microsoft.com/office/word/2023/wordml/word16du" xmlns:w16sdtdh="http://schemas.microsoft.com/office/word/2020/wordml/sdtdatahash" xmlns:w16sdtfl="http://schemas.microsoft.com/office/word/2024/wordml/sdtformatlock" xmlns:w16se="http://schemas.microsoft.com/office/word/2015/wordml/symex" mc:Ignorable="w14 w15 w16se w16cid w16 w16cex w16sdtdh w16sdtfl w16du">
   <w:docDefaults>
     <w:rPrDefault>
       <w:rPr>

</xml_diff>